<commit_message>
Implemented Auto Incrementing Id for students
</commit_message>
<xml_diff>
--- a/SDLC/PH-University/PH-university-requirement-analysis.docx
+++ b/SDLC/PH-University/PH-university-requirement-analysis.docx
@@ -599,11 +599,9 @@
           <w:numId w:val="6"/>
         </w:numPr>
       </w:pPr>
-      <w:proofErr w:type="spellStart"/>
       <w:r>
         <w:t>needsPasswordChange</w:t>
       </w:r>
-      <w:proofErr w:type="spellEnd"/>
     </w:p>
     <w:p>
       <w:pPr>
@@ -623,37 +621,31 @@
           <w:numId w:val="6"/>
         </w:numPr>
       </w:pPr>
-      <w:proofErr w:type="spellStart"/>
       <w:r>
         <w:t>isDeleted</w:t>
       </w:r>
-      <w:proofErr w:type="spellEnd"/>
-    </w:p>
-    <w:p>
-      <w:pPr>
-        <w:numPr>
-          <w:ilvl w:val="1"/>
-          <w:numId w:val="6"/>
-        </w:numPr>
-      </w:pPr>
-      <w:proofErr w:type="spellStart"/>
+    </w:p>
+    <w:p>
+      <w:pPr>
+        <w:numPr>
+          <w:ilvl w:val="1"/>
+          <w:numId w:val="6"/>
+        </w:numPr>
+      </w:pPr>
       <w:r>
         <w:t>createdAt</w:t>
       </w:r>
-      <w:proofErr w:type="spellEnd"/>
-    </w:p>
-    <w:p>
-      <w:pPr>
-        <w:numPr>
-          <w:ilvl w:val="1"/>
-          <w:numId w:val="6"/>
-        </w:numPr>
-      </w:pPr>
-      <w:proofErr w:type="spellStart"/>
+    </w:p>
+    <w:p>
+      <w:pPr>
+        <w:numPr>
+          <w:ilvl w:val="1"/>
+          <w:numId w:val="6"/>
+        </w:numPr>
+      </w:pPr>
       <w:r>
         <w:t>updatedAt</w:t>
       </w:r>
-      <w:proofErr w:type="spellEnd"/>
     </w:p>
     <w:p>
       <w:pPr>
@@ -699,6 +691,17 @@
         </w:numPr>
       </w:pPr>
       <w:r>
+        <w:t>user</w:t>
+      </w:r>
+    </w:p>
+    <w:p>
+      <w:pPr>
+        <w:numPr>
+          <w:ilvl w:val="1"/>
+          <w:numId w:val="6"/>
+        </w:numPr>
+      </w:pPr>
+      <w:r>
         <w:t>name</w:t>
       </w:r>
     </w:p>
@@ -720,11 +723,9 @@
           <w:numId w:val="6"/>
         </w:numPr>
       </w:pPr>
-      <w:proofErr w:type="spellStart"/>
       <w:r>
         <w:t>dateOfBirth</w:t>
       </w:r>
-      <w:proofErr w:type="spellEnd"/>
     </w:p>
     <w:p>
       <w:pPr>
@@ -744,51 +745,43 @@
           <w:numId w:val="6"/>
         </w:numPr>
       </w:pPr>
-      <w:proofErr w:type="spellStart"/>
-      <w:r>
+      <w:r>
+        <w:lastRenderedPageBreak/>
         <w:t>contactNo</w:t>
       </w:r>
-      <w:proofErr w:type="spellEnd"/>
-    </w:p>
-    <w:p>
-      <w:pPr>
-        <w:numPr>
-          <w:ilvl w:val="1"/>
-          <w:numId w:val="6"/>
-        </w:numPr>
-      </w:pPr>
-      <w:proofErr w:type="spellStart"/>
-      <w:r>
-        <w:lastRenderedPageBreak/>
+    </w:p>
+    <w:p>
+      <w:pPr>
+        <w:numPr>
+          <w:ilvl w:val="1"/>
+          <w:numId w:val="6"/>
+        </w:numPr>
+      </w:pPr>
+      <w:r>
         <w:t>emergencyContactNo</w:t>
       </w:r>
-      <w:proofErr w:type="spellEnd"/>
-    </w:p>
-    <w:p>
-      <w:pPr>
-        <w:numPr>
-          <w:ilvl w:val="1"/>
-          <w:numId w:val="6"/>
-        </w:numPr>
-      </w:pPr>
-      <w:proofErr w:type="spellStart"/>
+    </w:p>
+    <w:p>
+      <w:pPr>
+        <w:numPr>
+          <w:ilvl w:val="1"/>
+          <w:numId w:val="6"/>
+        </w:numPr>
+      </w:pPr>
       <w:r>
         <w:t>presentAddress</w:t>
       </w:r>
-      <w:proofErr w:type="spellEnd"/>
-    </w:p>
-    <w:p>
-      <w:pPr>
-        <w:numPr>
-          <w:ilvl w:val="1"/>
-          <w:numId w:val="6"/>
-        </w:numPr>
-      </w:pPr>
-      <w:proofErr w:type="spellStart"/>
+    </w:p>
+    <w:p>
+      <w:pPr>
+        <w:numPr>
+          <w:ilvl w:val="1"/>
+          <w:numId w:val="6"/>
+        </w:numPr>
+      </w:pPr>
       <w:r>
         <w:t>permanentAddress</w:t>
       </w:r>
-      <w:proofErr w:type="spellEnd"/>
     </w:p>
     <w:p>
       <w:pPr>
@@ -808,76 +801,75 @@
           <w:numId w:val="6"/>
         </w:numPr>
       </w:pPr>
-      <w:proofErr w:type="spellStart"/>
       <w:r>
         <w:t>localGuardian</w:t>
       </w:r>
-      <w:proofErr w:type="spellEnd"/>
-    </w:p>
-    <w:p>
-      <w:pPr>
-        <w:numPr>
-          <w:ilvl w:val="1"/>
-          <w:numId w:val="6"/>
-        </w:numPr>
-      </w:pPr>
-      <w:proofErr w:type="spellStart"/>
+    </w:p>
+    <w:p>
+      <w:pPr>
+        <w:numPr>
+          <w:ilvl w:val="1"/>
+          <w:numId w:val="6"/>
+        </w:numPr>
+      </w:pPr>
       <w:r>
         <w:t>profileImage</w:t>
       </w:r>
-      <w:proofErr w:type="spellEnd"/>
-    </w:p>
-    <w:p>
-      <w:pPr>
-        <w:numPr>
-          <w:ilvl w:val="1"/>
-          <w:numId w:val="6"/>
-        </w:numPr>
-      </w:pPr>
-      <w:proofErr w:type="spellStart"/>
+    </w:p>
+    <w:p>
+      <w:pPr>
+        <w:numPr>
+          <w:ilvl w:val="1"/>
+          <w:numId w:val="6"/>
+        </w:numPr>
+      </w:pPr>
+      <w:r>
+        <w:t>admissionSemester</w:t>
+      </w:r>
+    </w:p>
+    <w:p>
+      <w:pPr>
+        <w:numPr>
+          <w:ilvl w:val="1"/>
+          <w:numId w:val="6"/>
+        </w:numPr>
+      </w:pPr>
       <w:r>
         <w:t>academicDepartment</w:t>
       </w:r>
-      <w:proofErr w:type="spellEnd"/>
-    </w:p>
-    <w:p>
-      <w:pPr>
-        <w:numPr>
-          <w:ilvl w:val="1"/>
-          <w:numId w:val="6"/>
-        </w:numPr>
-      </w:pPr>
-      <w:proofErr w:type="spellStart"/>
+    </w:p>
+    <w:p>
+      <w:pPr>
+        <w:numPr>
+          <w:ilvl w:val="1"/>
+          <w:numId w:val="6"/>
+        </w:numPr>
+      </w:pPr>
       <w:r>
         <w:t>isDeleted</w:t>
       </w:r>
-      <w:proofErr w:type="spellEnd"/>
-    </w:p>
-    <w:p>
-      <w:pPr>
-        <w:numPr>
-          <w:ilvl w:val="1"/>
-          <w:numId w:val="6"/>
-        </w:numPr>
-      </w:pPr>
-      <w:proofErr w:type="spellStart"/>
+    </w:p>
+    <w:p>
+      <w:pPr>
+        <w:numPr>
+          <w:ilvl w:val="1"/>
+          <w:numId w:val="6"/>
+        </w:numPr>
+      </w:pPr>
       <w:r>
         <w:t>createdAt</w:t>
       </w:r>
-      <w:proofErr w:type="spellEnd"/>
-    </w:p>
-    <w:p>
-      <w:pPr>
-        <w:numPr>
-          <w:ilvl w:val="1"/>
-          <w:numId w:val="6"/>
-        </w:numPr>
-      </w:pPr>
-      <w:proofErr w:type="spellStart"/>
+    </w:p>
+    <w:p>
+      <w:pPr>
+        <w:numPr>
+          <w:ilvl w:val="1"/>
+          <w:numId w:val="6"/>
+        </w:numPr>
+      </w:pPr>
       <w:r>
         <w:t>updatedAt</w:t>
       </w:r>
-      <w:proofErr w:type="spellEnd"/>
     </w:p>
     <w:p>
       <w:pPr>
@@ -944,11 +936,9 @@
           <w:numId w:val="6"/>
         </w:numPr>
       </w:pPr>
-      <w:proofErr w:type="spellStart"/>
       <w:r>
         <w:t>dateOfBirth</w:t>
       </w:r>
-      <w:proofErr w:type="spellEnd"/>
     </w:p>
     <w:p>
       <w:pPr>
@@ -968,128 +958,108 @@
           <w:numId w:val="6"/>
         </w:numPr>
       </w:pPr>
-      <w:proofErr w:type="spellStart"/>
       <w:r>
         <w:t>contactNo</w:t>
       </w:r>
-      <w:proofErr w:type="spellEnd"/>
-    </w:p>
-    <w:p>
-      <w:pPr>
-        <w:numPr>
-          <w:ilvl w:val="1"/>
-          <w:numId w:val="6"/>
-        </w:numPr>
-      </w:pPr>
-      <w:proofErr w:type="spellStart"/>
+    </w:p>
+    <w:p>
+      <w:pPr>
+        <w:numPr>
+          <w:ilvl w:val="1"/>
+          <w:numId w:val="6"/>
+        </w:numPr>
+      </w:pPr>
       <w:r>
         <w:t>emergencyContactNo</w:t>
       </w:r>
-      <w:proofErr w:type="spellEnd"/>
-    </w:p>
-    <w:p>
-      <w:pPr>
-        <w:numPr>
-          <w:ilvl w:val="1"/>
-          <w:numId w:val="6"/>
-        </w:numPr>
-      </w:pPr>
-      <w:proofErr w:type="spellStart"/>
+    </w:p>
+    <w:p>
+      <w:pPr>
+        <w:numPr>
+          <w:ilvl w:val="1"/>
+          <w:numId w:val="6"/>
+        </w:numPr>
+      </w:pPr>
       <w:r>
         <w:t>presentAddress</w:t>
       </w:r>
-      <w:proofErr w:type="spellEnd"/>
-    </w:p>
-    <w:p>
-      <w:pPr>
-        <w:numPr>
-          <w:ilvl w:val="1"/>
-          <w:numId w:val="6"/>
-        </w:numPr>
-      </w:pPr>
-      <w:proofErr w:type="spellStart"/>
+    </w:p>
+    <w:p>
+      <w:pPr>
+        <w:numPr>
+          <w:ilvl w:val="1"/>
+          <w:numId w:val="6"/>
+        </w:numPr>
+      </w:pPr>
       <w:r>
         <w:t>permanentAddress</w:t>
       </w:r>
-      <w:proofErr w:type="spellEnd"/>
-    </w:p>
-    <w:p>
-      <w:pPr>
-        <w:numPr>
-          <w:ilvl w:val="1"/>
-          <w:numId w:val="6"/>
-        </w:numPr>
-      </w:pPr>
-      <w:proofErr w:type="spellStart"/>
+    </w:p>
+    <w:p>
+      <w:pPr>
+        <w:numPr>
+          <w:ilvl w:val="1"/>
+          <w:numId w:val="6"/>
+        </w:numPr>
+      </w:pPr>
       <w:r>
         <w:t>profileImage</w:t>
       </w:r>
-      <w:proofErr w:type="spellEnd"/>
-    </w:p>
-    <w:p>
-      <w:pPr>
-        <w:numPr>
-          <w:ilvl w:val="1"/>
-          <w:numId w:val="6"/>
-        </w:numPr>
-      </w:pPr>
-      <w:proofErr w:type="spellStart"/>
+    </w:p>
+    <w:p>
+      <w:pPr>
+        <w:numPr>
+          <w:ilvl w:val="1"/>
+          <w:numId w:val="6"/>
+        </w:numPr>
+      </w:pPr>
       <w:r>
         <w:t>academicFaculty</w:t>
       </w:r>
-      <w:proofErr w:type="spellEnd"/>
-    </w:p>
-    <w:p>
-      <w:pPr>
-        <w:numPr>
-          <w:ilvl w:val="1"/>
-          <w:numId w:val="6"/>
-        </w:numPr>
-      </w:pPr>
-      <w:proofErr w:type="spellStart"/>
+    </w:p>
+    <w:p>
+      <w:pPr>
+        <w:numPr>
+          <w:ilvl w:val="1"/>
+          <w:numId w:val="6"/>
+        </w:numPr>
+      </w:pPr>
       <w:r>
         <w:t>academicDepartment</w:t>
       </w:r>
-      <w:proofErr w:type="spellEnd"/>
-    </w:p>
-    <w:p>
-      <w:pPr>
-        <w:numPr>
-          <w:ilvl w:val="1"/>
-          <w:numId w:val="6"/>
-        </w:numPr>
-      </w:pPr>
-      <w:proofErr w:type="spellStart"/>
+    </w:p>
+    <w:p>
+      <w:pPr>
+        <w:numPr>
+          <w:ilvl w:val="1"/>
+          <w:numId w:val="6"/>
+        </w:numPr>
+      </w:pPr>
       <w:r>
         <w:t>isDeleted</w:t>
       </w:r>
-      <w:proofErr w:type="spellEnd"/>
-    </w:p>
-    <w:p>
-      <w:pPr>
-        <w:numPr>
-          <w:ilvl w:val="1"/>
-          <w:numId w:val="6"/>
-        </w:numPr>
-      </w:pPr>
-      <w:proofErr w:type="spellStart"/>
+    </w:p>
+    <w:p>
+      <w:pPr>
+        <w:numPr>
+          <w:ilvl w:val="1"/>
+          <w:numId w:val="6"/>
+        </w:numPr>
+      </w:pPr>
       <w:r>
         <w:t>createAt</w:t>
       </w:r>
-      <w:proofErr w:type="spellEnd"/>
-    </w:p>
-    <w:p>
-      <w:pPr>
-        <w:numPr>
-          <w:ilvl w:val="1"/>
-          <w:numId w:val="6"/>
-        </w:numPr>
-      </w:pPr>
-      <w:proofErr w:type="spellStart"/>
+    </w:p>
+    <w:p>
+      <w:pPr>
+        <w:numPr>
+          <w:ilvl w:val="1"/>
+          <w:numId w:val="6"/>
+        </w:numPr>
+      </w:pPr>
       <w:r>
         <w:t>updatedAt</w:t>
       </w:r>
-      <w:proofErr w:type="spellEnd"/>
     </w:p>
     <w:p>
       <w:pPr>
@@ -1156,11 +1126,9 @@
           <w:numId w:val="6"/>
         </w:numPr>
       </w:pPr>
-      <w:proofErr w:type="spellStart"/>
       <w:r>
         <w:t>dateOfBirth</w:t>
       </w:r>
-      <w:proofErr w:type="spellEnd"/>
     </w:p>
     <w:p>
       <w:pPr>
@@ -1180,116 +1148,98 @@
           <w:numId w:val="6"/>
         </w:numPr>
       </w:pPr>
-      <w:proofErr w:type="spellStart"/>
       <w:r>
         <w:t>contactNo</w:t>
       </w:r>
-      <w:proofErr w:type="spellEnd"/>
-    </w:p>
-    <w:p>
-      <w:pPr>
-        <w:numPr>
-          <w:ilvl w:val="1"/>
-          <w:numId w:val="6"/>
-        </w:numPr>
-      </w:pPr>
-      <w:proofErr w:type="spellStart"/>
+    </w:p>
+    <w:p>
+      <w:pPr>
+        <w:numPr>
+          <w:ilvl w:val="1"/>
+          <w:numId w:val="6"/>
+        </w:numPr>
+      </w:pPr>
       <w:r>
         <w:t>emergencyContactNo</w:t>
       </w:r>
-      <w:proofErr w:type="spellEnd"/>
-    </w:p>
-    <w:p>
-      <w:pPr>
-        <w:numPr>
-          <w:ilvl w:val="1"/>
-          <w:numId w:val="6"/>
-        </w:numPr>
-      </w:pPr>
-      <w:proofErr w:type="spellStart"/>
+    </w:p>
+    <w:p>
+      <w:pPr>
+        <w:numPr>
+          <w:ilvl w:val="1"/>
+          <w:numId w:val="6"/>
+        </w:numPr>
+      </w:pPr>
       <w:r>
         <w:t>presentAddress</w:t>
       </w:r>
-      <w:proofErr w:type="spellEnd"/>
-    </w:p>
-    <w:p>
-      <w:pPr>
-        <w:numPr>
-          <w:ilvl w:val="1"/>
-          <w:numId w:val="6"/>
-        </w:numPr>
-      </w:pPr>
-      <w:proofErr w:type="spellStart"/>
+    </w:p>
+    <w:p>
+      <w:pPr>
+        <w:numPr>
+          <w:ilvl w:val="1"/>
+          <w:numId w:val="6"/>
+        </w:numPr>
+      </w:pPr>
       <w:r>
         <w:t>permanentAddress</w:t>
       </w:r>
-      <w:proofErr w:type="spellEnd"/>
-    </w:p>
-    <w:p>
-      <w:pPr>
-        <w:numPr>
-          <w:ilvl w:val="1"/>
-          <w:numId w:val="6"/>
-        </w:numPr>
-      </w:pPr>
-      <w:proofErr w:type="spellStart"/>
+    </w:p>
+    <w:p>
+      <w:pPr>
+        <w:numPr>
+          <w:ilvl w:val="1"/>
+          <w:numId w:val="6"/>
+        </w:numPr>
+      </w:pPr>
       <w:r>
         <w:t>profileImage</w:t>
       </w:r>
-      <w:proofErr w:type="spellEnd"/>
-    </w:p>
-    <w:p>
-      <w:pPr>
-        <w:numPr>
-          <w:ilvl w:val="1"/>
-          <w:numId w:val="6"/>
-        </w:numPr>
-      </w:pPr>
-      <w:proofErr w:type="spellStart"/>
-      <w:r>
+    </w:p>
+    <w:p>
+      <w:pPr>
+        <w:numPr>
+          <w:ilvl w:val="1"/>
+          <w:numId w:val="6"/>
+        </w:numPr>
+      </w:pPr>
+      <w:r>
+        <w:lastRenderedPageBreak/>
         <w:t>managementDepartment</w:t>
       </w:r>
-      <w:proofErr w:type="spellEnd"/>
-    </w:p>
-    <w:p>
-      <w:pPr>
-        <w:numPr>
-          <w:ilvl w:val="1"/>
-          <w:numId w:val="6"/>
-        </w:numPr>
-      </w:pPr>
-      <w:proofErr w:type="spellStart"/>
+    </w:p>
+    <w:p>
+      <w:pPr>
+        <w:numPr>
+          <w:ilvl w:val="1"/>
+          <w:numId w:val="6"/>
+        </w:numPr>
+      </w:pPr>
       <w:r>
         <w:t>isDeleted</w:t>
       </w:r>
-      <w:proofErr w:type="spellEnd"/>
-    </w:p>
-    <w:p>
-      <w:pPr>
-        <w:numPr>
-          <w:ilvl w:val="1"/>
-          <w:numId w:val="6"/>
-        </w:numPr>
-      </w:pPr>
-      <w:proofErr w:type="spellStart"/>
-      <w:r>
-        <w:lastRenderedPageBreak/>
+    </w:p>
+    <w:p>
+      <w:pPr>
+        <w:numPr>
+          <w:ilvl w:val="1"/>
+          <w:numId w:val="6"/>
+        </w:numPr>
+      </w:pPr>
+      <w:r>
         <w:t>createAt</w:t>
       </w:r>
-      <w:proofErr w:type="spellEnd"/>
-    </w:p>
-    <w:p>
-      <w:pPr>
-        <w:numPr>
-          <w:ilvl w:val="1"/>
-          <w:numId w:val="6"/>
-        </w:numPr>
-      </w:pPr>
-      <w:proofErr w:type="spellStart"/>
+    </w:p>
+    <w:p>
+      <w:pPr>
+        <w:numPr>
+          <w:ilvl w:val="1"/>
+          <w:numId w:val="6"/>
+        </w:numPr>
+      </w:pPr>
       <w:r>
         <w:t>updatedAt</w:t>
       </w:r>
-      <w:proofErr w:type="spellEnd"/>
     </w:p>
     <w:p>
       <w:pPr>
@@ -1343,11 +1293,9 @@
           <w:numId w:val="10"/>
         </w:numPr>
       </w:pPr>
-      <w:proofErr w:type="spellStart"/>
       <w:r>
         <w:t>startMonth</w:t>
       </w:r>
-      <w:proofErr w:type="spellEnd"/>
     </w:p>
     <w:p>
       <w:pPr>
@@ -1357,11 +1305,9 @@
           <w:numId w:val="10"/>
         </w:numPr>
       </w:pPr>
-      <w:proofErr w:type="spellStart"/>
       <w:r>
         <w:t>endMonth</w:t>
       </w:r>
-      <w:proofErr w:type="spellEnd"/>
     </w:p>
     <w:p>
       <w:pPr>
@@ -1433,13 +1379,8 @@
           <w:numId w:val="3"/>
         </w:numPr>
       </w:pPr>
-      <w:proofErr w:type="gramStart"/>
-      <w:r>
-        <w:t>students(</w:t>
-      </w:r>
-      <w:proofErr w:type="gramEnd"/>
-      <w:r>
-        <w:t>GET)</w:t>
+      <w:r>
+        <w:t>students(GET)</w:t>
       </w:r>
     </w:p>
     <w:p>
@@ -1472,15 +1413,7 @@
         </w:numPr>
       </w:pPr>
       <w:r>
-        <w:t>students</w:t>
-      </w:r>
-      <w:proofErr w:type="gramStart"/>
-      <w:r>
-        <w:t>/ :id</w:t>
-      </w:r>
-      <w:proofErr w:type="gramEnd"/>
-      <w:r>
-        <w:t xml:space="preserve"> (DELETE)</w:t>
+        <w:t>students/ :id (DELETE)</w:t>
       </w:r>
     </w:p>
     <w:p>
@@ -1548,15 +1481,7 @@
         </w:numPr>
       </w:pPr>
       <w:r>
-        <w:t xml:space="preserve">faculties </w:t>
-      </w:r>
-      <w:proofErr w:type="gramStart"/>
-      <w:r>
-        <w:t>/ :id</w:t>
-      </w:r>
-      <w:proofErr w:type="gramEnd"/>
-      <w:r>
-        <w:t xml:space="preserve"> (DELETE)</w:t>
+        <w:t>faculties / :id (DELETE)</w:t>
       </w:r>
     </w:p>
     <w:p>
@@ -1587,13 +1512,8 @@
           <w:numId w:val="4"/>
         </w:numPr>
       </w:pPr>
-      <w:proofErr w:type="gramStart"/>
-      <w:r>
-        <w:t>admins(</w:t>
-      </w:r>
-      <w:proofErr w:type="gramEnd"/>
-      <w:r>
-        <w:t>GET)</w:t>
+      <w:r>
+        <w:t>admins(GET)</w:t>
       </w:r>
     </w:p>
     <w:p>
@@ -1626,15 +1546,7 @@
         </w:numPr>
       </w:pPr>
       <w:r>
-        <w:t>admins</w:t>
-      </w:r>
-      <w:proofErr w:type="gramStart"/>
-      <w:r>
-        <w:t>/ :id</w:t>
-      </w:r>
-      <w:proofErr w:type="gramEnd"/>
-      <w:r>
-        <w:t xml:space="preserve"> (DELETE)</w:t>
+        <w:t>admins/ :id (DELETE)</w:t>
       </w:r>
     </w:p>
     <w:p>
@@ -1655,6 +1567,7 @@
       <w:bookmarkStart w:id="25" w:name="_lg4vm9y7yi9y" w:colFirst="0" w:colLast="0"/>
       <w:bookmarkEnd w:id="25"/>
       <w:r>
+        <w:lastRenderedPageBreak/>
         <w:t>Auth</w:t>
       </w:r>
     </w:p>
@@ -1677,7 +1590,6 @@
         </w:numPr>
       </w:pPr>
       <w:r>
-        <w:lastRenderedPageBreak/>
         <w:t>auth/refresh-token</w:t>
       </w:r>
     </w:p>

</xml_diff>

<commit_message>
Update Data models for Academic faculty
</commit_message>
<xml_diff>
--- a/SDLC/PH-University/PH-university-requirement-analysis.docx
+++ b/SDLC/PH-University/PH-university-requirement-analysis.docx
@@ -599,9 +599,11 @@
           <w:numId w:val="6"/>
         </w:numPr>
       </w:pPr>
+      <w:proofErr w:type="spellStart"/>
       <w:r>
         <w:t>needsPasswordChange</w:t>
       </w:r>
+      <w:proofErr w:type="spellEnd"/>
     </w:p>
     <w:p>
       <w:pPr>
@@ -621,31 +623,37 @@
           <w:numId w:val="6"/>
         </w:numPr>
       </w:pPr>
+      <w:proofErr w:type="spellStart"/>
       <w:r>
         <w:t>isDeleted</w:t>
       </w:r>
-    </w:p>
-    <w:p>
-      <w:pPr>
-        <w:numPr>
-          <w:ilvl w:val="1"/>
-          <w:numId w:val="6"/>
-        </w:numPr>
-      </w:pPr>
+      <w:proofErr w:type="spellEnd"/>
+    </w:p>
+    <w:p>
+      <w:pPr>
+        <w:numPr>
+          <w:ilvl w:val="1"/>
+          <w:numId w:val="6"/>
+        </w:numPr>
+      </w:pPr>
+      <w:proofErr w:type="spellStart"/>
       <w:r>
         <w:t>createdAt</w:t>
       </w:r>
-    </w:p>
-    <w:p>
-      <w:pPr>
-        <w:numPr>
-          <w:ilvl w:val="1"/>
-          <w:numId w:val="6"/>
-        </w:numPr>
-      </w:pPr>
+      <w:proofErr w:type="spellEnd"/>
+    </w:p>
+    <w:p>
+      <w:pPr>
+        <w:numPr>
+          <w:ilvl w:val="1"/>
+          <w:numId w:val="6"/>
+        </w:numPr>
+      </w:pPr>
+      <w:proofErr w:type="spellStart"/>
       <w:r>
         <w:t>updatedAt</w:t>
       </w:r>
+      <w:proofErr w:type="spellEnd"/>
     </w:p>
     <w:p>
       <w:pPr>
@@ -723,9 +731,11 @@
           <w:numId w:val="6"/>
         </w:numPr>
       </w:pPr>
+      <w:proofErr w:type="spellStart"/>
       <w:r>
         <w:t>dateOfBirth</w:t>
       </w:r>
+      <w:proofErr w:type="spellEnd"/>
     </w:p>
     <w:p>
       <w:pPr>
@@ -745,43 +755,51 @@
           <w:numId w:val="6"/>
         </w:numPr>
       </w:pPr>
+      <w:proofErr w:type="spellStart"/>
       <w:r>
         <w:lastRenderedPageBreak/>
         <w:t>contactNo</w:t>
       </w:r>
-    </w:p>
-    <w:p>
-      <w:pPr>
-        <w:numPr>
-          <w:ilvl w:val="1"/>
-          <w:numId w:val="6"/>
-        </w:numPr>
-      </w:pPr>
+      <w:proofErr w:type="spellEnd"/>
+    </w:p>
+    <w:p>
+      <w:pPr>
+        <w:numPr>
+          <w:ilvl w:val="1"/>
+          <w:numId w:val="6"/>
+        </w:numPr>
+      </w:pPr>
+      <w:proofErr w:type="spellStart"/>
       <w:r>
         <w:t>emergencyContactNo</w:t>
       </w:r>
-    </w:p>
-    <w:p>
-      <w:pPr>
-        <w:numPr>
-          <w:ilvl w:val="1"/>
-          <w:numId w:val="6"/>
-        </w:numPr>
-      </w:pPr>
+      <w:proofErr w:type="spellEnd"/>
+    </w:p>
+    <w:p>
+      <w:pPr>
+        <w:numPr>
+          <w:ilvl w:val="1"/>
+          <w:numId w:val="6"/>
+        </w:numPr>
+      </w:pPr>
+      <w:proofErr w:type="spellStart"/>
       <w:r>
         <w:t>presentAddress</w:t>
       </w:r>
-    </w:p>
-    <w:p>
-      <w:pPr>
-        <w:numPr>
-          <w:ilvl w:val="1"/>
-          <w:numId w:val="6"/>
-        </w:numPr>
-      </w:pPr>
+      <w:proofErr w:type="spellEnd"/>
+    </w:p>
+    <w:p>
+      <w:pPr>
+        <w:numPr>
+          <w:ilvl w:val="1"/>
+          <w:numId w:val="6"/>
+        </w:numPr>
+      </w:pPr>
+      <w:proofErr w:type="spellStart"/>
       <w:r>
         <w:t>permanentAddress</w:t>
       </w:r>
+      <w:proofErr w:type="spellEnd"/>
     </w:p>
     <w:p>
       <w:pPr>
@@ -801,75 +819,89 @@
           <w:numId w:val="6"/>
         </w:numPr>
       </w:pPr>
+      <w:proofErr w:type="spellStart"/>
       <w:r>
         <w:t>localGuardian</w:t>
       </w:r>
-    </w:p>
-    <w:p>
-      <w:pPr>
-        <w:numPr>
-          <w:ilvl w:val="1"/>
-          <w:numId w:val="6"/>
-        </w:numPr>
-      </w:pPr>
+      <w:proofErr w:type="spellEnd"/>
+    </w:p>
+    <w:p>
+      <w:pPr>
+        <w:numPr>
+          <w:ilvl w:val="1"/>
+          <w:numId w:val="6"/>
+        </w:numPr>
+      </w:pPr>
+      <w:proofErr w:type="spellStart"/>
       <w:r>
         <w:t>profileImage</w:t>
       </w:r>
-    </w:p>
-    <w:p>
-      <w:pPr>
-        <w:numPr>
-          <w:ilvl w:val="1"/>
-          <w:numId w:val="6"/>
-        </w:numPr>
-      </w:pPr>
+      <w:proofErr w:type="spellEnd"/>
+    </w:p>
+    <w:p>
+      <w:pPr>
+        <w:numPr>
+          <w:ilvl w:val="1"/>
+          <w:numId w:val="6"/>
+        </w:numPr>
+      </w:pPr>
+      <w:proofErr w:type="spellStart"/>
       <w:r>
         <w:t>admissionSemester</w:t>
       </w:r>
-    </w:p>
-    <w:p>
-      <w:pPr>
-        <w:numPr>
-          <w:ilvl w:val="1"/>
-          <w:numId w:val="6"/>
-        </w:numPr>
-      </w:pPr>
+      <w:proofErr w:type="spellEnd"/>
+    </w:p>
+    <w:p>
+      <w:pPr>
+        <w:numPr>
+          <w:ilvl w:val="1"/>
+          <w:numId w:val="6"/>
+        </w:numPr>
+      </w:pPr>
+      <w:proofErr w:type="spellStart"/>
       <w:r>
         <w:t>academicDepartment</w:t>
       </w:r>
-    </w:p>
-    <w:p>
-      <w:pPr>
-        <w:numPr>
-          <w:ilvl w:val="1"/>
-          <w:numId w:val="6"/>
-        </w:numPr>
-      </w:pPr>
+      <w:proofErr w:type="spellEnd"/>
+    </w:p>
+    <w:p>
+      <w:pPr>
+        <w:numPr>
+          <w:ilvl w:val="1"/>
+          <w:numId w:val="6"/>
+        </w:numPr>
+      </w:pPr>
+      <w:proofErr w:type="spellStart"/>
       <w:r>
         <w:t>isDeleted</w:t>
       </w:r>
-    </w:p>
-    <w:p>
-      <w:pPr>
-        <w:numPr>
-          <w:ilvl w:val="1"/>
-          <w:numId w:val="6"/>
-        </w:numPr>
-      </w:pPr>
+      <w:proofErr w:type="spellEnd"/>
+    </w:p>
+    <w:p>
+      <w:pPr>
+        <w:numPr>
+          <w:ilvl w:val="1"/>
+          <w:numId w:val="6"/>
+        </w:numPr>
+      </w:pPr>
+      <w:proofErr w:type="spellStart"/>
       <w:r>
         <w:t>createdAt</w:t>
       </w:r>
-    </w:p>
-    <w:p>
-      <w:pPr>
-        <w:numPr>
-          <w:ilvl w:val="1"/>
-          <w:numId w:val="6"/>
-        </w:numPr>
-      </w:pPr>
+      <w:proofErr w:type="spellEnd"/>
+    </w:p>
+    <w:p>
+      <w:pPr>
+        <w:numPr>
+          <w:ilvl w:val="1"/>
+          <w:numId w:val="6"/>
+        </w:numPr>
+      </w:pPr>
+      <w:proofErr w:type="spellStart"/>
       <w:r>
         <w:t>updatedAt</w:t>
       </w:r>
+      <w:proofErr w:type="spellEnd"/>
     </w:p>
     <w:p>
       <w:pPr>
@@ -936,9 +968,11 @@
           <w:numId w:val="6"/>
         </w:numPr>
       </w:pPr>
+      <w:proofErr w:type="spellStart"/>
       <w:r>
         <w:t>dateOfBirth</w:t>
       </w:r>
+      <w:proofErr w:type="spellEnd"/>
     </w:p>
     <w:p>
       <w:pPr>
@@ -958,108 +992,128 @@
           <w:numId w:val="6"/>
         </w:numPr>
       </w:pPr>
+      <w:proofErr w:type="spellStart"/>
       <w:r>
         <w:t>contactNo</w:t>
       </w:r>
-    </w:p>
-    <w:p>
-      <w:pPr>
-        <w:numPr>
-          <w:ilvl w:val="1"/>
-          <w:numId w:val="6"/>
-        </w:numPr>
-      </w:pPr>
+      <w:proofErr w:type="spellEnd"/>
+    </w:p>
+    <w:p>
+      <w:pPr>
+        <w:numPr>
+          <w:ilvl w:val="1"/>
+          <w:numId w:val="6"/>
+        </w:numPr>
+      </w:pPr>
+      <w:proofErr w:type="spellStart"/>
       <w:r>
         <w:t>emergencyContactNo</w:t>
       </w:r>
-    </w:p>
-    <w:p>
-      <w:pPr>
-        <w:numPr>
-          <w:ilvl w:val="1"/>
-          <w:numId w:val="6"/>
-        </w:numPr>
-      </w:pPr>
+      <w:proofErr w:type="spellEnd"/>
+    </w:p>
+    <w:p>
+      <w:pPr>
+        <w:numPr>
+          <w:ilvl w:val="1"/>
+          <w:numId w:val="6"/>
+        </w:numPr>
+      </w:pPr>
+      <w:proofErr w:type="spellStart"/>
       <w:r>
         <w:t>presentAddress</w:t>
       </w:r>
-    </w:p>
-    <w:p>
-      <w:pPr>
-        <w:numPr>
-          <w:ilvl w:val="1"/>
-          <w:numId w:val="6"/>
-        </w:numPr>
-      </w:pPr>
+      <w:proofErr w:type="spellEnd"/>
+    </w:p>
+    <w:p>
+      <w:pPr>
+        <w:numPr>
+          <w:ilvl w:val="1"/>
+          <w:numId w:val="6"/>
+        </w:numPr>
+      </w:pPr>
+      <w:proofErr w:type="spellStart"/>
       <w:r>
         <w:t>permanentAddress</w:t>
       </w:r>
-    </w:p>
-    <w:p>
-      <w:pPr>
-        <w:numPr>
-          <w:ilvl w:val="1"/>
-          <w:numId w:val="6"/>
-        </w:numPr>
-      </w:pPr>
+      <w:proofErr w:type="spellEnd"/>
+    </w:p>
+    <w:p>
+      <w:pPr>
+        <w:numPr>
+          <w:ilvl w:val="1"/>
+          <w:numId w:val="6"/>
+        </w:numPr>
+      </w:pPr>
+      <w:proofErr w:type="spellStart"/>
       <w:r>
         <w:t>profileImage</w:t>
       </w:r>
-    </w:p>
-    <w:p>
-      <w:pPr>
-        <w:numPr>
-          <w:ilvl w:val="1"/>
-          <w:numId w:val="6"/>
-        </w:numPr>
-      </w:pPr>
+      <w:proofErr w:type="spellEnd"/>
+    </w:p>
+    <w:p>
+      <w:pPr>
+        <w:numPr>
+          <w:ilvl w:val="1"/>
+          <w:numId w:val="6"/>
+        </w:numPr>
+      </w:pPr>
+      <w:proofErr w:type="spellStart"/>
       <w:r>
         <w:t>academicFaculty</w:t>
       </w:r>
-    </w:p>
-    <w:p>
-      <w:pPr>
-        <w:numPr>
-          <w:ilvl w:val="1"/>
-          <w:numId w:val="6"/>
-        </w:numPr>
-      </w:pPr>
+      <w:proofErr w:type="spellEnd"/>
+    </w:p>
+    <w:p>
+      <w:pPr>
+        <w:numPr>
+          <w:ilvl w:val="1"/>
+          <w:numId w:val="6"/>
+        </w:numPr>
+      </w:pPr>
+      <w:proofErr w:type="spellStart"/>
       <w:r>
         <w:t>academicDepartment</w:t>
       </w:r>
-    </w:p>
-    <w:p>
-      <w:pPr>
-        <w:numPr>
-          <w:ilvl w:val="1"/>
-          <w:numId w:val="6"/>
-        </w:numPr>
-      </w:pPr>
+      <w:proofErr w:type="spellEnd"/>
+    </w:p>
+    <w:p>
+      <w:pPr>
+        <w:numPr>
+          <w:ilvl w:val="1"/>
+          <w:numId w:val="6"/>
+        </w:numPr>
+      </w:pPr>
+      <w:proofErr w:type="spellStart"/>
       <w:r>
         <w:t>isDeleted</w:t>
       </w:r>
-    </w:p>
-    <w:p>
-      <w:pPr>
-        <w:numPr>
-          <w:ilvl w:val="1"/>
-          <w:numId w:val="6"/>
-        </w:numPr>
-      </w:pPr>
+      <w:proofErr w:type="spellEnd"/>
+    </w:p>
+    <w:p>
+      <w:pPr>
+        <w:numPr>
+          <w:ilvl w:val="1"/>
+          <w:numId w:val="6"/>
+        </w:numPr>
+      </w:pPr>
+      <w:proofErr w:type="spellStart"/>
       <w:r>
         <w:t>createAt</w:t>
       </w:r>
-    </w:p>
-    <w:p>
-      <w:pPr>
-        <w:numPr>
-          <w:ilvl w:val="1"/>
-          <w:numId w:val="6"/>
-        </w:numPr>
-      </w:pPr>
+      <w:proofErr w:type="spellEnd"/>
+    </w:p>
+    <w:p>
+      <w:pPr>
+        <w:numPr>
+          <w:ilvl w:val="1"/>
+          <w:numId w:val="6"/>
+        </w:numPr>
+      </w:pPr>
+      <w:proofErr w:type="spellStart"/>
       <w:r>
         <w:t>updatedAt</w:t>
       </w:r>
+      <w:proofErr w:type="spellEnd"/>
     </w:p>
     <w:p>
       <w:pPr>
@@ -1126,9 +1180,11 @@
           <w:numId w:val="6"/>
         </w:numPr>
       </w:pPr>
+      <w:proofErr w:type="spellStart"/>
       <w:r>
         <w:t>dateOfBirth</w:t>
       </w:r>
+      <w:proofErr w:type="spellEnd"/>
     </w:p>
     <w:p>
       <w:pPr>
@@ -1148,98 +1204,116 @@
           <w:numId w:val="6"/>
         </w:numPr>
       </w:pPr>
+      <w:proofErr w:type="spellStart"/>
       <w:r>
         <w:t>contactNo</w:t>
       </w:r>
-    </w:p>
-    <w:p>
-      <w:pPr>
-        <w:numPr>
-          <w:ilvl w:val="1"/>
-          <w:numId w:val="6"/>
-        </w:numPr>
-      </w:pPr>
+      <w:proofErr w:type="spellEnd"/>
+    </w:p>
+    <w:p>
+      <w:pPr>
+        <w:numPr>
+          <w:ilvl w:val="1"/>
+          <w:numId w:val="6"/>
+        </w:numPr>
+      </w:pPr>
+      <w:proofErr w:type="spellStart"/>
       <w:r>
         <w:t>emergencyContactNo</w:t>
       </w:r>
-    </w:p>
-    <w:p>
-      <w:pPr>
-        <w:numPr>
-          <w:ilvl w:val="1"/>
-          <w:numId w:val="6"/>
-        </w:numPr>
-      </w:pPr>
+      <w:proofErr w:type="spellEnd"/>
+    </w:p>
+    <w:p>
+      <w:pPr>
+        <w:numPr>
+          <w:ilvl w:val="1"/>
+          <w:numId w:val="6"/>
+        </w:numPr>
+      </w:pPr>
+      <w:proofErr w:type="spellStart"/>
       <w:r>
         <w:t>presentAddress</w:t>
       </w:r>
-    </w:p>
-    <w:p>
-      <w:pPr>
-        <w:numPr>
-          <w:ilvl w:val="1"/>
-          <w:numId w:val="6"/>
-        </w:numPr>
-      </w:pPr>
+      <w:proofErr w:type="spellEnd"/>
+    </w:p>
+    <w:p>
+      <w:pPr>
+        <w:numPr>
+          <w:ilvl w:val="1"/>
+          <w:numId w:val="6"/>
+        </w:numPr>
+      </w:pPr>
+      <w:proofErr w:type="spellStart"/>
       <w:r>
         <w:t>permanentAddress</w:t>
       </w:r>
-    </w:p>
-    <w:p>
-      <w:pPr>
-        <w:numPr>
-          <w:ilvl w:val="1"/>
-          <w:numId w:val="6"/>
-        </w:numPr>
-      </w:pPr>
+      <w:proofErr w:type="spellEnd"/>
+    </w:p>
+    <w:p>
+      <w:pPr>
+        <w:numPr>
+          <w:ilvl w:val="1"/>
+          <w:numId w:val="6"/>
+        </w:numPr>
+      </w:pPr>
+      <w:proofErr w:type="spellStart"/>
       <w:r>
         <w:t>profileImage</w:t>
       </w:r>
-    </w:p>
-    <w:p>
-      <w:pPr>
-        <w:numPr>
-          <w:ilvl w:val="1"/>
-          <w:numId w:val="6"/>
-        </w:numPr>
-      </w:pPr>
+      <w:proofErr w:type="spellEnd"/>
+    </w:p>
+    <w:p>
+      <w:pPr>
+        <w:numPr>
+          <w:ilvl w:val="1"/>
+          <w:numId w:val="6"/>
+        </w:numPr>
+      </w:pPr>
+      <w:proofErr w:type="spellStart"/>
       <w:r>
         <w:lastRenderedPageBreak/>
         <w:t>managementDepartment</w:t>
       </w:r>
-    </w:p>
-    <w:p>
-      <w:pPr>
-        <w:numPr>
-          <w:ilvl w:val="1"/>
-          <w:numId w:val="6"/>
-        </w:numPr>
-      </w:pPr>
+      <w:proofErr w:type="spellEnd"/>
+    </w:p>
+    <w:p>
+      <w:pPr>
+        <w:numPr>
+          <w:ilvl w:val="1"/>
+          <w:numId w:val="6"/>
+        </w:numPr>
+      </w:pPr>
+      <w:proofErr w:type="spellStart"/>
       <w:r>
         <w:t>isDeleted</w:t>
       </w:r>
-    </w:p>
-    <w:p>
-      <w:pPr>
-        <w:numPr>
-          <w:ilvl w:val="1"/>
-          <w:numId w:val="6"/>
-        </w:numPr>
-      </w:pPr>
+      <w:proofErr w:type="spellEnd"/>
+    </w:p>
+    <w:p>
+      <w:pPr>
+        <w:numPr>
+          <w:ilvl w:val="1"/>
+          <w:numId w:val="6"/>
+        </w:numPr>
+      </w:pPr>
+      <w:proofErr w:type="spellStart"/>
       <w:r>
         <w:t>createAt</w:t>
       </w:r>
-    </w:p>
-    <w:p>
-      <w:pPr>
-        <w:numPr>
-          <w:ilvl w:val="1"/>
-          <w:numId w:val="6"/>
-        </w:numPr>
-      </w:pPr>
+      <w:proofErr w:type="spellEnd"/>
+    </w:p>
+    <w:p>
+      <w:pPr>
+        <w:numPr>
+          <w:ilvl w:val="1"/>
+          <w:numId w:val="6"/>
+        </w:numPr>
+      </w:pPr>
+      <w:proofErr w:type="spellStart"/>
       <w:r>
         <w:t>updatedAt</w:t>
       </w:r>
+      <w:proofErr w:type="spellEnd"/>
     </w:p>
     <w:p>
       <w:pPr>
@@ -1293,9 +1367,11 @@
           <w:numId w:val="10"/>
         </w:numPr>
       </w:pPr>
+      <w:proofErr w:type="spellStart"/>
       <w:r>
         <w:t>startMonth</w:t>
       </w:r>
+      <w:proofErr w:type="spellEnd"/>
     </w:p>
     <w:p>
       <w:pPr>
@@ -1305,9 +1381,182 @@
           <w:numId w:val="10"/>
         </w:numPr>
       </w:pPr>
+      <w:proofErr w:type="spellStart"/>
       <w:r>
         <w:t>endMonth</w:t>
       </w:r>
+      <w:proofErr w:type="spellEnd"/>
+    </w:p>
+    <w:p>
+      <w:pPr>
+        <w:pStyle w:val="ListParagraph"/>
+        <w:numPr>
+          <w:ilvl w:val="0"/>
+          <w:numId w:val="10"/>
+        </w:numPr>
+      </w:pPr>
+      <w:proofErr w:type="spellStart"/>
+      <w:r>
+        <w:t>createdAt</w:t>
+      </w:r>
+      <w:proofErr w:type="spellEnd"/>
+    </w:p>
+    <w:p>
+      <w:pPr>
+        <w:pStyle w:val="ListParagraph"/>
+        <w:numPr>
+          <w:ilvl w:val="0"/>
+          <w:numId w:val="10"/>
+        </w:numPr>
+      </w:pPr>
+      <w:proofErr w:type="spellStart"/>
+      <w:r>
+        <w:t>updatedAt</w:t>
+      </w:r>
+      <w:proofErr w:type="spellEnd"/>
+    </w:p>
+    <w:p>
+      <w:pPr>
+        <w:pStyle w:val="Heading2"/>
+      </w:pPr>
+      <w:r>
+        <w:t>Academic Faculty</w:t>
+      </w:r>
+    </w:p>
+    <w:p>
+      <w:pPr>
+        <w:pStyle w:val="ListParagraph"/>
+        <w:numPr>
+          <w:ilvl w:val="0"/>
+          <w:numId w:val="11"/>
+        </w:numPr>
+      </w:pPr>
+      <w:r>
+        <w:t>_id</w:t>
+      </w:r>
+    </w:p>
+    <w:p>
+      <w:pPr>
+        <w:pStyle w:val="ListParagraph"/>
+        <w:numPr>
+          <w:ilvl w:val="0"/>
+          <w:numId w:val="11"/>
+        </w:numPr>
+      </w:pPr>
+      <w:r>
+        <w:t>name</w:t>
+      </w:r>
+    </w:p>
+    <w:p>
+      <w:pPr>
+        <w:pStyle w:val="ListParagraph"/>
+        <w:numPr>
+          <w:ilvl w:val="0"/>
+          <w:numId w:val="11"/>
+        </w:numPr>
+      </w:pPr>
+      <w:proofErr w:type="spellStart"/>
+      <w:r>
+        <w:t>createdAt</w:t>
+      </w:r>
+      <w:proofErr w:type="spellEnd"/>
+    </w:p>
+    <w:p>
+      <w:pPr>
+        <w:pStyle w:val="ListParagraph"/>
+        <w:numPr>
+          <w:ilvl w:val="0"/>
+          <w:numId w:val="11"/>
+        </w:numPr>
+      </w:pPr>
+      <w:proofErr w:type="spellStart"/>
+      <w:r>
+        <w:t>updatedAt</w:t>
+      </w:r>
+      <w:proofErr w:type="spellEnd"/>
+    </w:p>
+    <w:p>
+      <w:pPr>
+        <w:pStyle w:val="Heading2"/>
+      </w:pPr>
+      <w:r>
+        <w:t>Academic Department</w:t>
+      </w:r>
+    </w:p>
+    <w:p>
+      <w:pPr>
+        <w:pStyle w:val="ListParagraph"/>
+        <w:numPr>
+          <w:ilvl w:val="0"/>
+          <w:numId w:val="12"/>
+        </w:numPr>
+      </w:pPr>
+      <w:r>
+        <w:t>_id</w:t>
+      </w:r>
+    </w:p>
+    <w:p>
+      <w:pPr>
+        <w:pStyle w:val="ListParagraph"/>
+        <w:numPr>
+          <w:ilvl w:val="0"/>
+          <w:numId w:val="12"/>
+        </w:numPr>
+      </w:pPr>
+      <w:r>
+        <w:t>name</w:t>
+      </w:r>
+    </w:p>
+    <w:p>
+      <w:pPr>
+        <w:pStyle w:val="ListParagraph"/>
+        <w:numPr>
+          <w:ilvl w:val="0"/>
+          <w:numId w:val="12"/>
+        </w:numPr>
+      </w:pPr>
+      <w:proofErr w:type="spellStart"/>
+      <w:r>
+        <w:t>academicFaculty</w:t>
+      </w:r>
+      <w:proofErr w:type="spellEnd"/>
+    </w:p>
+    <w:p>
+      <w:pPr>
+        <w:pStyle w:val="ListParagraph"/>
+        <w:numPr>
+          <w:ilvl w:val="0"/>
+          <w:numId w:val="12"/>
+        </w:numPr>
+      </w:pPr>
+      <w:proofErr w:type="spellStart"/>
+      <w:r>
+        <w:t>createAt</w:t>
+      </w:r>
+      <w:proofErr w:type="spellEnd"/>
+    </w:p>
+    <w:p>
+      <w:pPr>
+        <w:pStyle w:val="ListParagraph"/>
+        <w:numPr>
+          <w:ilvl w:val="0"/>
+          <w:numId w:val="12"/>
+        </w:numPr>
+      </w:pPr>
+      <w:proofErr w:type="spellStart"/>
+      <w:r>
+        <w:t>updatedAt</w:t>
+      </w:r>
+      <w:proofErr w:type="spellEnd"/>
+    </w:p>
+    <w:p>
+      <w:pPr>
+        <w:pStyle w:val="ListParagraph"/>
+        <w:numPr>
+          <w:ilvl w:val="0"/>
+          <w:numId w:val="12"/>
+        </w:numPr>
+      </w:pPr>
     </w:p>
     <w:p>
       <w:pPr>
@@ -1379,8 +1628,13 @@
           <w:numId w:val="3"/>
         </w:numPr>
       </w:pPr>
-      <w:r>
-        <w:t>students(GET)</w:t>
+      <w:proofErr w:type="gramStart"/>
+      <w:r>
+        <w:t>students(</w:t>
+      </w:r>
+      <w:proofErr w:type="gramEnd"/>
+      <w:r>
+        <w:t>GET)</w:t>
       </w:r>
     </w:p>
     <w:p>
@@ -1413,7 +1667,15 @@
         </w:numPr>
       </w:pPr>
       <w:r>
-        <w:t>students/ :id (DELETE)</w:t>
+        <w:t>students</w:t>
+      </w:r>
+      <w:proofErr w:type="gramStart"/>
+      <w:r>
+        <w:t>/ :id</w:t>
+      </w:r>
+      <w:proofErr w:type="gramEnd"/>
+      <w:r>
+        <w:t xml:space="preserve"> (DELETE)</w:t>
       </w:r>
     </w:p>
     <w:p>
@@ -1424,6 +1686,7 @@
         </w:numPr>
       </w:pPr>
       <w:r>
+        <w:lastRenderedPageBreak/>
         <w:t>students/my-profile</w:t>
       </w:r>
     </w:p>
@@ -1481,7 +1744,15 @@
         </w:numPr>
       </w:pPr>
       <w:r>
-        <w:t>faculties / :id (DELETE)</w:t>
+        <w:t xml:space="preserve">faculties </w:t>
+      </w:r>
+      <w:proofErr w:type="gramStart"/>
+      <w:r>
+        <w:t>/ :id</w:t>
+      </w:r>
+      <w:proofErr w:type="gramEnd"/>
+      <w:r>
+        <w:t xml:space="preserve"> (DELETE)</w:t>
       </w:r>
     </w:p>
     <w:p>
@@ -1512,8 +1783,13 @@
           <w:numId w:val="4"/>
         </w:numPr>
       </w:pPr>
-      <w:r>
-        <w:t>admins(GET)</w:t>
+      <w:proofErr w:type="gramStart"/>
+      <w:r>
+        <w:t>admins(</w:t>
+      </w:r>
+      <w:proofErr w:type="gramEnd"/>
+      <w:r>
+        <w:t>GET)</w:t>
       </w:r>
     </w:p>
     <w:p>
@@ -1546,7 +1822,15 @@
         </w:numPr>
       </w:pPr>
       <w:r>
-        <w:t>admins/ :id (DELETE)</w:t>
+        <w:t>admins</w:t>
+      </w:r>
+      <w:proofErr w:type="gramStart"/>
+      <w:r>
+        <w:t>/ :id</w:t>
+      </w:r>
+      <w:proofErr w:type="gramEnd"/>
+      <w:r>
+        <w:t xml:space="preserve"> (DELETE)</w:t>
       </w:r>
     </w:p>
     <w:p>
@@ -1567,7 +1851,6 @@
       <w:bookmarkStart w:id="25" w:name="_lg4vm9y7yi9y" w:colFirst="0" w:colLast="0"/>
       <w:bookmarkEnd w:id="25"/>
       <w:r>
-        <w:lastRenderedPageBreak/>
         <w:t>Auth</w:t>
       </w:r>
     </w:p>
@@ -1867,6 +2150,119 @@
     </w:lvl>
   </w:abstractNum>
   <w:abstractNum w:abstractNumId="2" w15:restartNumberingAfterBreak="0">
+    <w:nsid w:val="1676654D"/>
+    <w:multiLevelType w:val="hybridMultilevel"/>
+    <w:tmpl w:val="1ED09B9C"/>
+    <w:lvl w:ilvl="0" w:tplc="04090001">
+      <w:start w:val="1"/>
+      <w:numFmt w:val="bullet"/>
+      <w:lvlText w:val=""/>
+      <w:lvlJc w:val="left"/>
+      <w:pPr>
+        <w:ind w:left="1800" w:hanging="360"/>
+      </w:pPr>
+      <w:rPr>
+        <w:rFonts w:ascii="Symbol" w:hAnsi="Symbol" w:hint="default"/>
+      </w:rPr>
+    </w:lvl>
+    <w:lvl w:ilvl="1" w:tplc="04090003" w:tentative="1">
+      <w:start w:val="1"/>
+      <w:numFmt w:val="bullet"/>
+      <w:lvlText w:val="o"/>
+      <w:lvlJc w:val="left"/>
+      <w:pPr>
+        <w:ind w:left="2520" w:hanging="360"/>
+      </w:pPr>
+      <w:rPr>
+        <w:rFonts w:ascii="Courier New" w:hAnsi="Courier New" w:cs="Courier New" w:hint="default"/>
+      </w:rPr>
+    </w:lvl>
+    <w:lvl w:ilvl="2" w:tplc="04090005" w:tentative="1">
+      <w:start w:val="1"/>
+      <w:numFmt w:val="bullet"/>
+      <w:lvlText w:val=""/>
+      <w:lvlJc w:val="left"/>
+      <w:pPr>
+        <w:ind w:left="3240" w:hanging="360"/>
+      </w:pPr>
+      <w:rPr>
+        <w:rFonts w:ascii="Wingdings" w:hAnsi="Wingdings" w:hint="default"/>
+      </w:rPr>
+    </w:lvl>
+    <w:lvl w:ilvl="3" w:tplc="04090001" w:tentative="1">
+      <w:start w:val="1"/>
+      <w:numFmt w:val="bullet"/>
+      <w:lvlText w:val=""/>
+      <w:lvlJc w:val="left"/>
+      <w:pPr>
+        <w:ind w:left="3960" w:hanging="360"/>
+      </w:pPr>
+      <w:rPr>
+        <w:rFonts w:ascii="Symbol" w:hAnsi="Symbol" w:hint="default"/>
+      </w:rPr>
+    </w:lvl>
+    <w:lvl w:ilvl="4" w:tplc="04090003" w:tentative="1">
+      <w:start w:val="1"/>
+      <w:numFmt w:val="bullet"/>
+      <w:lvlText w:val="o"/>
+      <w:lvlJc w:val="left"/>
+      <w:pPr>
+        <w:ind w:left="4680" w:hanging="360"/>
+      </w:pPr>
+      <w:rPr>
+        <w:rFonts w:ascii="Courier New" w:hAnsi="Courier New" w:cs="Courier New" w:hint="default"/>
+      </w:rPr>
+    </w:lvl>
+    <w:lvl w:ilvl="5" w:tplc="04090005" w:tentative="1">
+      <w:start w:val="1"/>
+      <w:numFmt w:val="bullet"/>
+      <w:lvlText w:val=""/>
+      <w:lvlJc w:val="left"/>
+      <w:pPr>
+        <w:ind w:left="5400" w:hanging="360"/>
+      </w:pPr>
+      <w:rPr>
+        <w:rFonts w:ascii="Wingdings" w:hAnsi="Wingdings" w:hint="default"/>
+      </w:rPr>
+    </w:lvl>
+    <w:lvl w:ilvl="6" w:tplc="04090001" w:tentative="1">
+      <w:start w:val="1"/>
+      <w:numFmt w:val="bullet"/>
+      <w:lvlText w:val=""/>
+      <w:lvlJc w:val="left"/>
+      <w:pPr>
+        <w:ind w:left="6120" w:hanging="360"/>
+      </w:pPr>
+      <w:rPr>
+        <w:rFonts w:ascii="Symbol" w:hAnsi="Symbol" w:hint="default"/>
+      </w:rPr>
+    </w:lvl>
+    <w:lvl w:ilvl="7" w:tplc="04090003" w:tentative="1">
+      <w:start w:val="1"/>
+      <w:numFmt w:val="bullet"/>
+      <w:lvlText w:val="o"/>
+      <w:lvlJc w:val="left"/>
+      <w:pPr>
+        <w:ind w:left="6840" w:hanging="360"/>
+      </w:pPr>
+      <w:rPr>
+        <w:rFonts w:ascii="Courier New" w:hAnsi="Courier New" w:cs="Courier New" w:hint="default"/>
+      </w:rPr>
+    </w:lvl>
+    <w:lvl w:ilvl="8" w:tplc="04090005" w:tentative="1">
+      <w:start w:val="1"/>
+      <w:numFmt w:val="bullet"/>
+      <w:lvlText w:val=""/>
+      <w:lvlJc w:val="left"/>
+      <w:pPr>
+        <w:ind w:left="7560" w:hanging="360"/>
+      </w:pPr>
+      <w:rPr>
+        <w:rFonts w:ascii="Wingdings" w:hAnsi="Wingdings" w:hint="default"/>
+      </w:rPr>
+    </w:lvl>
+  </w:abstractNum>
+  <w:abstractNum w:abstractNumId="3" w15:restartNumberingAfterBreak="0">
     <w:nsid w:val="24A9313E"/>
     <w:multiLevelType w:val="multilevel"/>
     <w:tmpl w:val="987C78D6"/>
@@ -1979,7 +2375,7 @@
       </w:rPr>
     </w:lvl>
   </w:abstractNum>
-  <w:abstractNum w:abstractNumId="3" w15:restartNumberingAfterBreak="0">
+  <w:abstractNum w:abstractNumId="4" w15:restartNumberingAfterBreak="0">
     <w:nsid w:val="45DA00C7"/>
     <w:multiLevelType w:val="multilevel"/>
     <w:tmpl w:val="ED22C0E0"/>
@@ -2092,7 +2488,7 @@
       </w:rPr>
     </w:lvl>
   </w:abstractNum>
-  <w:abstractNum w:abstractNumId="4" w15:restartNumberingAfterBreak="0">
+  <w:abstractNum w:abstractNumId="5" w15:restartNumberingAfterBreak="0">
     <w:nsid w:val="469868CA"/>
     <w:multiLevelType w:val="multilevel"/>
     <w:tmpl w:val="CF8CA284"/>
@@ -2205,7 +2601,7 @@
       </w:rPr>
     </w:lvl>
   </w:abstractNum>
-  <w:abstractNum w:abstractNumId="5" w15:restartNumberingAfterBreak="0">
+  <w:abstractNum w:abstractNumId="6" w15:restartNumberingAfterBreak="0">
     <w:nsid w:val="578B4899"/>
     <w:multiLevelType w:val="hybridMultilevel"/>
     <w:tmpl w:val="A39AB596"/>
@@ -2318,7 +2714,7 @@
       </w:rPr>
     </w:lvl>
   </w:abstractNum>
-  <w:abstractNum w:abstractNumId="6" w15:restartNumberingAfterBreak="0">
+  <w:abstractNum w:abstractNumId="7" w15:restartNumberingAfterBreak="0">
     <w:nsid w:val="5D391264"/>
     <w:multiLevelType w:val="multilevel"/>
     <w:tmpl w:val="581ED1AC"/>
@@ -2431,7 +2827,7 @@
       </w:rPr>
     </w:lvl>
   </w:abstractNum>
-  <w:abstractNum w:abstractNumId="7" w15:restartNumberingAfterBreak="0">
+  <w:abstractNum w:abstractNumId="8" w15:restartNumberingAfterBreak="0">
     <w:nsid w:val="5FB31A76"/>
     <w:multiLevelType w:val="hybridMultilevel"/>
     <w:tmpl w:val="8A1E4AA0"/>
@@ -2544,7 +2940,7 @@
       </w:rPr>
     </w:lvl>
   </w:abstractNum>
-  <w:abstractNum w:abstractNumId="8" w15:restartNumberingAfterBreak="0">
+  <w:abstractNum w:abstractNumId="9" w15:restartNumberingAfterBreak="0">
     <w:nsid w:val="6471058B"/>
     <w:multiLevelType w:val="multilevel"/>
     <w:tmpl w:val="BEC63C76"/>
@@ -2657,7 +3053,120 @@
       </w:rPr>
     </w:lvl>
   </w:abstractNum>
-  <w:abstractNum w:abstractNumId="9" w15:restartNumberingAfterBreak="0">
+  <w:abstractNum w:abstractNumId="10" w15:restartNumberingAfterBreak="0">
+    <w:nsid w:val="6BEC0421"/>
+    <w:multiLevelType w:val="hybridMultilevel"/>
+    <w:tmpl w:val="34C6D734"/>
+    <w:lvl w:ilvl="0" w:tplc="04090001">
+      <w:start w:val="1"/>
+      <w:numFmt w:val="bullet"/>
+      <w:lvlText w:val=""/>
+      <w:lvlJc w:val="left"/>
+      <w:pPr>
+        <w:ind w:left="1800" w:hanging="360"/>
+      </w:pPr>
+      <w:rPr>
+        <w:rFonts w:ascii="Symbol" w:hAnsi="Symbol" w:hint="default"/>
+      </w:rPr>
+    </w:lvl>
+    <w:lvl w:ilvl="1" w:tplc="04090003" w:tentative="1">
+      <w:start w:val="1"/>
+      <w:numFmt w:val="bullet"/>
+      <w:lvlText w:val="o"/>
+      <w:lvlJc w:val="left"/>
+      <w:pPr>
+        <w:ind w:left="2520" w:hanging="360"/>
+      </w:pPr>
+      <w:rPr>
+        <w:rFonts w:ascii="Courier New" w:hAnsi="Courier New" w:cs="Courier New" w:hint="default"/>
+      </w:rPr>
+    </w:lvl>
+    <w:lvl w:ilvl="2" w:tplc="04090005" w:tentative="1">
+      <w:start w:val="1"/>
+      <w:numFmt w:val="bullet"/>
+      <w:lvlText w:val=""/>
+      <w:lvlJc w:val="left"/>
+      <w:pPr>
+        <w:ind w:left="3240" w:hanging="360"/>
+      </w:pPr>
+      <w:rPr>
+        <w:rFonts w:ascii="Wingdings" w:hAnsi="Wingdings" w:hint="default"/>
+      </w:rPr>
+    </w:lvl>
+    <w:lvl w:ilvl="3" w:tplc="04090001" w:tentative="1">
+      <w:start w:val="1"/>
+      <w:numFmt w:val="bullet"/>
+      <w:lvlText w:val=""/>
+      <w:lvlJc w:val="left"/>
+      <w:pPr>
+        <w:ind w:left="3960" w:hanging="360"/>
+      </w:pPr>
+      <w:rPr>
+        <w:rFonts w:ascii="Symbol" w:hAnsi="Symbol" w:hint="default"/>
+      </w:rPr>
+    </w:lvl>
+    <w:lvl w:ilvl="4" w:tplc="04090003" w:tentative="1">
+      <w:start w:val="1"/>
+      <w:numFmt w:val="bullet"/>
+      <w:lvlText w:val="o"/>
+      <w:lvlJc w:val="left"/>
+      <w:pPr>
+        <w:ind w:left="4680" w:hanging="360"/>
+      </w:pPr>
+      <w:rPr>
+        <w:rFonts w:ascii="Courier New" w:hAnsi="Courier New" w:cs="Courier New" w:hint="default"/>
+      </w:rPr>
+    </w:lvl>
+    <w:lvl w:ilvl="5" w:tplc="04090005" w:tentative="1">
+      <w:start w:val="1"/>
+      <w:numFmt w:val="bullet"/>
+      <w:lvlText w:val=""/>
+      <w:lvlJc w:val="left"/>
+      <w:pPr>
+        <w:ind w:left="5400" w:hanging="360"/>
+      </w:pPr>
+      <w:rPr>
+        <w:rFonts w:ascii="Wingdings" w:hAnsi="Wingdings" w:hint="default"/>
+      </w:rPr>
+    </w:lvl>
+    <w:lvl w:ilvl="6" w:tplc="04090001" w:tentative="1">
+      <w:start w:val="1"/>
+      <w:numFmt w:val="bullet"/>
+      <w:lvlText w:val=""/>
+      <w:lvlJc w:val="left"/>
+      <w:pPr>
+        <w:ind w:left="6120" w:hanging="360"/>
+      </w:pPr>
+      <w:rPr>
+        <w:rFonts w:ascii="Symbol" w:hAnsi="Symbol" w:hint="default"/>
+      </w:rPr>
+    </w:lvl>
+    <w:lvl w:ilvl="7" w:tplc="04090003" w:tentative="1">
+      <w:start w:val="1"/>
+      <w:numFmt w:val="bullet"/>
+      <w:lvlText w:val="o"/>
+      <w:lvlJc w:val="left"/>
+      <w:pPr>
+        <w:ind w:left="6840" w:hanging="360"/>
+      </w:pPr>
+      <w:rPr>
+        <w:rFonts w:ascii="Courier New" w:hAnsi="Courier New" w:cs="Courier New" w:hint="default"/>
+      </w:rPr>
+    </w:lvl>
+    <w:lvl w:ilvl="8" w:tplc="04090005" w:tentative="1">
+      <w:start w:val="1"/>
+      <w:numFmt w:val="bullet"/>
+      <w:lvlText w:val=""/>
+      <w:lvlJc w:val="left"/>
+      <w:pPr>
+        <w:ind w:left="7560" w:hanging="360"/>
+      </w:pPr>
+      <w:rPr>
+        <w:rFonts w:ascii="Wingdings" w:hAnsi="Wingdings" w:hint="default"/>
+      </w:rPr>
+    </w:lvl>
+  </w:abstractNum>
+  <w:abstractNum w:abstractNumId="11" w15:restartNumberingAfterBreak="0">
     <w:nsid w:val="79B2000E"/>
     <w:multiLevelType w:val="hybridMultilevel"/>
     <w:tmpl w:val="6AFEF7D4"/>
@@ -2771,10 +3280,10 @@
     </w:lvl>
   </w:abstractNum>
   <w:num w:numId="1" w16cid:durableId="1985741106">
-    <w:abstractNumId w:val="8"/>
+    <w:abstractNumId w:val="9"/>
   </w:num>
   <w:num w:numId="2" w16cid:durableId="857154678">
-    <w:abstractNumId w:val="6"/>
+    <w:abstractNumId w:val="7"/>
   </w:num>
   <w:num w:numId="3" w16cid:durableId="1303120745">
     <w:abstractNumId w:val="0"/>
@@ -2783,22 +3292,28 @@
     <w:abstractNumId w:val="1"/>
   </w:num>
   <w:num w:numId="5" w16cid:durableId="1871991772">
+    <w:abstractNumId w:val="3"/>
+  </w:num>
+  <w:num w:numId="6" w16cid:durableId="154153657">
+    <w:abstractNumId w:val="4"/>
+  </w:num>
+  <w:num w:numId="7" w16cid:durableId="1188131783">
+    <w:abstractNumId w:val="5"/>
+  </w:num>
+  <w:num w:numId="8" w16cid:durableId="616105515">
+    <w:abstractNumId w:val="6"/>
+  </w:num>
+  <w:num w:numId="9" w16cid:durableId="1048605148">
+    <w:abstractNumId w:val="8"/>
+  </w:num>
+  <w:num w:numId="10" w16cid:durableId="519470147">
+    <w:abstractNumId w:val="11"/>
+  </w:num>
+  <w:num w:numId="11" w16cid:durableId="580725689">
     <w:abstractNumId w:val="2"/>
   </w:num>
-  <w:num w:numId="6" w16cid:durableId="154153657">
-    <w:abstractNumId w:val="3"/>
-  </w:num>
-  <w:num w:numId="7" w16cid:durableId="1188131783">
-    <w:abstractNumId w:val="4"/>
-  </w:num>
-  <w:num w:numId="8" w16cid:durableId="616105515">
-    <w:abstractNumId w:val="5"/>
-  </w:num>
-  <w:num w:numId="9" w16cid:durableId="1048605148">
-    <w:abstractNumId w:val="7"/>
-  </w:num>
-  <w:num w:numId="10" w16cid:durableId="519470147">
-    <w:abstractNumId w:val="9"/>
+  <w:num w:numId="12" w16cid:durableId="912348855">
+    <w:abstractNumId w:val="10"/>
   </w:num>
 </w:numbering>
 </file>

</xml_diff>

<commit_message>
Handling Zod and Mongoose Validation Error
</commit_message>
<xml_diff>
--- a/SDLC/PH-University/PH-university-requirement-analysis.docx
+++ b/SDLC/PH-University/PH-university-requirement-analysis.docx
@@ -1285,7 +1285,33 @@
       </w:pPr>
       <w:proofErr w:type="spellStart"/>
       <w:r>
+        <w:t>admissionSemester</w:t>
+      </w:r>
+      <w:proofErr w:type="spellEnd"/>
+    </w:p>
+    <w:p>
+      <w:pPr>
+        <w:numPr>
+          <w:ilvl w:val="1"/>
+          <w:numId w:val="6"/>
+        </w:numPr>
+      </w:pPr>
+      <w:proofErr w:type="spellStart"/>
+      <w:r>
         <w:t>isDeleted</w:t>
+      </w:r>
+      <w:proofErr w:type="spellEnd"/>
+    </w:p>
+    <w:p>
+      <w:pPr>
+        <w:numPr>
+          <w:ilvl w:val="1"/>
+          <w:numId w:val="6"/>
+        </w:numPr>
+      </w:pPr>
+      <w:proofErr w:type="spellStart"/>
+      <w:r>
+        <w:t>academicDepartment</w:t>
       </w:r>
       <w:proofErr w:type="spellEnd"/>
     </w:p>
@@ -1656,6 +1682,7 @@
         </w:numPr>
       </w:pPr>
       <w:r>
+        <w:lastRenderedPageBreak/>
         <w:t>students/:id (PATCH)</w:t>
       </w:r>
     </w:p>
@@ -1686,7 +1713,6 @@
         </w:numPr>
       </w:pPr>
       <w:r>
-        <w:lastRenderedPageBreak/>
         <w:t>students/my-profile</w:t>
       </w:r>
     </w:p>

</xml_diff>